<commit_message>
proje 1-2 tamamlandı ve video dökümana eklendi.
</commit_message>
<xml_diff>
--- a/vize-rapor.docx
+++ b/vize-rapor.docx
@@ -169,7 +169,7 @@
     </w:p>
     <w:p>
       <w:pPr>
-        <w:spacing w:after="360" w:line="360" w:lineRule="auto"/>
+        <w:spacing w:after="0" w:line="360" w:lineRule="auto"/>
         <w:jc w:val="center"/>
         <w:rPr>
           <w:rFonts w:ascii="Arial" w:hAnsi="Arial" w:cs="Arial"/>
@@ -227,6 +227,48 @@
         </w:rPr>
         <w:t xml:space="preserve"> Yönetim Sistemleri Vize Proje Raporu</w:t>
       </w:r>
+    </w:p>
+    <w:p>
+      <w:pPr>
+        <w:spacing w:after="0" w:line="360" w:lineRule="auto"/>
+        <w:jc w:val="center"/>
+      </w:pPr>
+      <w:hyperlink r:id="rId8" w:history="1">
+        <w:r>
+          <w:rPr>
+            <w:rStyle w:val="Kpr"/>
+            <w:rFonts w:ascii="Arial" w:hAnsi="Arial" w:cs="Arial"/>
+            <w:bCs/>
+            <w:sz w:val="28"/>
+            <w:szCs w:val="28"/>
+          </w:rPr>
+          <w:t>https://github.com/oguzzaydogaan/BLM4522</w:t>
+        </w:r>
+      </w:hyperlink>
+    </w:p>
+    <w:p>
+      <w:pPr>
+        <w:spacing w:after="360" w:line="360" w:lineRule="auto"/>
+        <w:jc w:val="center"/>
+        <w:rPr>
+          <w:rFonts w:ascii="Arial" w:hAnsi="Arial" w:cs="Arial"/>
+          <w:bCs/>
+          <w:sz w:val="28"/>
+          <w:szCs w:val="28"/>
+        </w:rPr>
+      </w:pPr>
+      <w:hyperlink r:id="rId9" w:history="1">
+        <w:r>
+          <w:rPr>
+            <w:rStyle w:val="Kpr"/>
+            <w:rFonts w:ascii="Arial" w:hAnsi="Arial" w:cs="Arial"/>
+            <w:bCs/>
+            <w:sz w:val="28"/>
+            <w:szCs w:val="28"/>
+          </w:rPr>
+          <w:t>https://drive.google.com/file/d/17UWcCG6K5i0Vuxc8LgbvN2aRYebwlxx-/view?usp=sharing</w:t>
+        </w:r>
+      </w:hyperlink>
     </w:p>
     <w:p>
       <w:pPr>
@@ -470,6 +512,7 @@
       <w:r>
         <w:rPr>
           <w:rFonts w:ascii="Arial" w:hAnsi="Arial" w:cs="Arial"/>
+          <w:noProof/>
           <w:sz w:val="24"/>
           <w:szCs w:val="24"/>
         </w:rPr>
@@ -489,7 +532,7 @@
                     <pic:cNvPicPr/>
                   </pic:nvPicPr>
                   <pic:blipFill>
-                    <a:blip r:embed="rId8"/>
+                    <a:blip r:embed="rId10"/>
                     <a:stretch>
                       <a:fillRect/>
                     </a:stretch>
@@ -568,6 +611,7 @@
       <w:r>
         <w:rPr>
           <w:rFonts w:ascii="Arial" w:hAnsi="Arial" w:cs="Arial"/>
+          <w:noProof/>
           <w:sz w:val="24"/>
           <w:szCs w:val="24"/>
         </w:rPr>
@@ -587,7 +631,7 @@
                     <pic:cNvPicPr/>
                   </pic:nvPicPr>
                   <pic:blipFill>
-                    <a:blip r:embed="rId9"/>
+                    <a:blip r:embed="rId11"/>
                     <a:stretch>
                       <a:fillRect/>
                     </a:stretch>
@@ -740,6 +784,7 @@
       <w:r>
         <w:rPr>
           <w:rFonts w:ascii="Arial" w:hAnsi="Arial" w:cs="Arial"/>
+          <w:noProof/>
           <w:sz w:val="24"/>
           <w:szCs w:val="24"/>
         </w:rPr>
@@ -762,7 +807,7 @@
                     </pic:cNvPicPr>
                   </pic:nvPicPr>
                   <pic:blipFill>
-                    <a:blip r:embed="rId10">
+                    <a:blip r:embed="rId12">
                       <a:extLst>
                         <a:ext uri="{28A0092B-C50C-407E-A947-70E740481C1C}">
                           <a14:useLocalDpi xmlns:a14="http://schemas.microsoft.com/office/drawing/2010/main" val="0"/>
@@ -924,6 +969,7 @@
       <w:r>
         <w:rPr>
           <w:rFonts w:ascii="Arial" w:hAnsi="Arial" w:cs="Arial"/>
+          <w:noProof/>
           <w:sz w:val="24"/>
           <w:szCs w:val="24"/>
         </w:rPr>
@@ -945,7 +991,7 @@
                     </pic:cNvPicPr>
                   </pic:nvPicPr>
                   <pic:blipFill>
-                    <a:blip r:embed="rId11">
+                    <a:blip r:embed="rId13">
                       <a:extLst>
                         <a:ext uri="{28A0092B-C50C-407E-A947-70E740481C1C}">
                           <a14:useLocalDpi xmlns:a14="http://schemas.microsoft.com/office/drawing/2010/main" val="0"/>
@@ -1190,6 +1236,7 @@
       <w:r>
         <w:rPr>
           <w:rFonts w:ascii="Arial" w:hAnsi="Arial" w:cs="Arial"/>
+          <w:noProof/>
           <w:sz w:val="24"/>
           <w:szCs w:val="24"/>
         </w:rPr>
@@ -1211,7 +1258,7 @@
                     </pic:cNvPicPr>
                   </pic:nvPicPr>
                   <pic:blipFill>
-                    <a:blip r:embed="rId12">
+                    <a:blip r:embed="rId14">
                       <a:extLst>
                         <a:ext uri="{28A0092B-C50C-407E-A947-70E740481C1C}">
                           <a14:useLocalDpi xmlns:a14="http://schemas.microsoft.com/office/drawing/2010/main" val="0"/>
@@ -1390,6 +1437,7 @@
       <w:r>
         <w:rPr>
           <w:rFonts w:ascii="Arial" w:hAnsi="Arial" w:cs="Arial"/>
+          <w:noProof/>
           <w:sz w:val="24"/>
           <w:szCs w:val="24"/>
         </w:rPr>
@@ -1410,7 +1458,7 @@
                     <pic:cNvPicPr/>
                   </pic:nvPicPr>
                   <pic:blipFill>
-                    <a:blip r:embed="rId13"/>
+                    <a:blip r:embed="rId15"/>
                     <a:stretch>
                       <a:fillRect/>
                     </a:stretch>
@@ -1502,11 +1550,11 @@
         <w:t xml:space="preserve"> 2</w:t>
       </w:r>
       <w:r>
-        <w:t>: V</w:t>
-      </w:r>
-      <w:proofErr w:type="spellStart"/>
-      <w:r>
-        <w:t>eritabanı</w:t>
+        <w:t xml:space="preserve">: </w:t>
+      </w:r>
+      <w:proofErr w:type="spellStart"/>
+      <w:r>
+        <w:t>Veritabanı</w:t>
       </w:r>
       <w:proofErr w:type="spellEnd"/>
       <w:r>
@@ -1653,7 +1701,7 @@
                     </pic:cNvPicPr>
                   </pic:nvPicPr>
                   <pic:blipFill>
-                    <a:blip r:embed="rId14">
+                    <a:blip r:embed="rId16">
                       <a:extLst>
                         <a:ext uri="{28A0092B-C50C-407E-A947-70E740481C1C}">
                           <a14:useLocalDpi xmlns:a14="http://schemas.microsoft.com/office/drawing/2010/main" val="0"/>
@@ -1804,7 +1852,7 @@
                     </pic:cNvPicPr>
                   </pic:nvPicPr>
                   <pic:blipFill>
-                    <a:blip r:embed="rId15">
+                    <a:blip r:embed="rId17">
                       <a:extLst>
                         <a:ext uri="{28A0092B-C50C-407E-A947-70E740481C1C}">
                           <a14:useLocalDpi xmlns:a14="http://schemas.microsoft.com/office/drawing/2010/main" val="0"/>
@@ -1918,6 +1966,7 @@
       <w:r>
         <w:rPr>
           <w:rFonts w:ascii="Arial" w:hAnsi="Arial" w:cs="Arial"/>
+          <w:noProof/>
         </w:rPr>
         <w:drawing>
           <wp:inline distT="0" distB="0" distL="0" distR="0" wp14:anchorId="33C012D2" wp14:editId="6A9ECD5D">
@@ -1935,7 +1984,7 @@
                     <pic:cNvPicPr/>
                   </pic:nvPicPr>
                   <pic:blipFill>
-                    <a:blip r:embed="rId16"/>
+                    <a:blip r:embed="rId18"/>
                     <a:stretch>
                       <a:fillRect/>
                     </a:stretch>
@@ -2070,6 +2119,7 @@
       <w:r>
         <w:rPr>
           <w:rFonts w:ascii="Arial" w:hAnsi="Arial" w:cs="Arial"/>
+          <w:noProof/>
         </w:rPr>
         <w:drawing>
           <wp:inline distT="0" distB="0" distL="0" distR="0" wp14:anchorId="7D4598B6" wp14:editId="1B933B9D">
@@ -2087,7 +2137,7 @@
                     <pic:cNvPicPr/>
                   </pic:nvPicPr>
                   <pic:blipFill>
-                    <a:blip r:embed="rId17"/>
+                    <a:blip r:embed="rId19"/>
                     <a:stretch>
                       <a:fillRect/>
                     </a:stretch>
@@ -2197,7 +2247,7 @@
                     </pic:cNvPicPr>
                   </pic:nvPicPr>
                   <pic:blipFill>
-                    <a:blip r:embed="rId18">
+                    <a:blip r:embed="rId20">
                       <a:extLst>
                         <a:ext uri="{28A0092B-C50C-407E-A947-70E740481C1C}">
                           <a14:useLocalDpi xmlns:a14="http://schemas.microsoft.com/office/drawing/2010/main" val="0"/>
@@ -2241,6 +2291,7 @@
       <w:r>
         <w:rPr>
           <w:rFonts w:ascii="Arial" w:hAnsi="Arial" w:cs="Arial"/>
+          <w:noProof/>
         </w:rPr>
         <w:lastRenderedPageBreak/>
         <w:drawing>
@@ -2259,7 +2310,7 @@
                     <pic:cNvPicPr/>
                   </pic:nvPicPr>
                   <pic:blipFill>
-                    <a:blip r:embed="rId19"/>
+                    <a:blip r:embed="rId21"/>
                     <a:stretch>
                       <a:fillRect/>
                     </a:stretch>
@@ -2507,6 +2558,7 @@
       <w:r>
         <w:rPr>
           <w:rFonts w:ascii="Arial" w:hAnsi="Arial" w:cs="Arial"/>
+          <w:noProof/>
           <w:sz w:val="24"/>
           <w:szCs w:val="24"/>
         </w:rPr>
@@ -2526,7 +2578,7 @@
                     <pic:cNvPicPr/>
                   </pic:nvPicPr>
                   <pic:blipFill>
-                    <a:blip r:embed="rId20"/>
+                    <a:blip r:embed="rId22"/>
                     <a:stretch>
                       <a:fillRect/>
                     </a:stretch>
@@ -4736,6 +4788,7 @@
   <w:style w:type="character" w:default="1" w:styleId="VarsaylanParagrafYazTipi">
     <w:name w:val="Default Paragraph Font"/>
     <w:uiPriority w:val="1"/>
+    <w:semiHidden/>
     <w:unhideWhenUsed/>
   </w:style>
   <w:style w:type="table" w:default="1" w:styleId="NormalTablo">
@@ -5177,6 +5230,29 @@
       <w14:ligatures w14:val="none"/>
     </w:rPr>
   </w:style>
+  <w:style w:type="character" w:styleId="Kpr">
+    <w:name w:val="Hyperlink"/>
+    <w:basedOn w:val="VarsaylanParagrafYazTipi"/>
+    <w:uiPriority w:val="99"/>
+    <w:unhideWhenUsed/>
+    <w:rsid w:val="007F0E1C"/>
+    <w:rPr>
+      <w:color w:val="467886" w:themeColor="hyperlink"/>
+      <w:u w:val="single"/>
+    </w:rPr>
+  </w:style>
+  <w:style w:type="character" w:styleId="zmlenmeyenBahsetme">
+    <w:name w:val="Unresolved Mention"/>
+    <w:basedOn w:val="VarsaylanParagrafYazTipi"/>
+    <w:uiPriority w:val="99"/>
+    <w:semiHidden/>
+    <w:unhideWhenUsed/>
+    <w:rsid w:val="007F0E1C"/>
+    <w:rPr>
+      <w:color w:val="605E5C"/>
+      <w:shd w:val="clear" w:color="auto" w:fill="E1DFDD"/>
+    </w:rPr>
+  </w:style>
 </w:styles>
 </file>
 

</xml_diff>

<commit_message>
rapora içindekiler bölümü eklendi.
</commit_message>
<xml_diff>
--- a/vize-rapor.docx
+++ b/vize-rapor.docx
@@ -4,14 +4,14 @@
   <w:body>
     <w:p>
       <w:pPr>
-        <w:pStyle w:val="Balk1"/>
-        <w:spacing w:before="0" w:after="0" w:line="360" w:lineRule="auto"/>
+        <w:spacing w:after="0" w:line="360" w:lineRule="auto"/>
         <w:jc w:val="center"/>
         <w:rPr>
           <w:rFonts w:ascii="Arial" w:hAnsi="Arial" w:cs="Arial"/>
           <w:b/>
           <w:bCs/>
-          <w:color w:val="auto"/>
+          <w:sz w:val="28"/>
+          <w:szCs w:val="28"/>
         </w:rPr>
       </w:pPr>
       <w:r>
@@ -19,40 +19,10 @@
           <w:rFonts w:ascii="Arial" w:hAnsi="Arial" w:cs="Arial"/>
           <w:b/>
           <w:bCs/>
-          <w:color w:val="auto"/>
           <w:sz w:val="28"/>
           <w:szCs w:val="28"/>
         </w:rPr>
-        <w:t>ANKARA</w:t>
-      </w:r>
-      <w:r>
-        <w:rPr>
-          <w:rFonts w:ascii="Arial" w:hAnsi="Arial" w:cs="Arial"/>
-          <w:b/>
-          <w:bCs/>
-          <w:color w:val="auto"/>
-        </w:rPr>
-        <w:t xml:space="preserve"> </w:t>
-      </w:r>
-      <w:r>
-        <w:rPr>
-          <w:rFonts w:ascii="Arial" w:hAnsi="Arial" w:cs="Arial"/>
-          <w:b/>
-          <w:bCs/>
-          <w:color w:val="auto"/>
-          <w:sz w:val="28"/>
-          <w:szCs w:val="28"/>
-        </w:rPr>
-        <w:t>ÜNİVERSİTESİ</w:t>
-      </w:r>
-      <w:r>
-        <w:rPr>
-          <w:rFonts w:ascii="Arial" w:hAnsi="Arial" w:cs="Arial"/>
-          <w:b/>
-          <w:bCs/>
-          <w:color w:val="auto"/>
-        </w:rPr>
-        <w:t xml:space="preserve"> </w:t>
+        <w:t>ANKARA ÜNİVERSİTESİ</w:t>
       </w:r>
     </w:p>
     <w:p>
@@ -135,7 +105,7 @@
                     </pic:cNvPicPr>
                   </pic:nvPicPr>
                   <pic:blipFill>
-                    <a:blip r:embed="rId7">
+                    <a:blip r:embed="rId8">
                       <a:extLst>
                         <a:ext uri="{28A0092B-C50C-407E-A947-70E740481C1C}">
                           <a14:useLocalDpi xmlns:a14="http://schemas.microsoft.com/office/drawing/2010/main" val="0"/>
@@ -233,7 +203,7 @@
         <w:spacing w:after="0" w:line="360" w:lineRule="auto"/>
         <w:jc w:val="center"/>
       </w:pPr>
-      <w:hyperlink r:id="rId8" w:history="1">
+      <w:hyperlink r:id="rId9" w:history="1">
         <w:r>
           <w:rPr>
             <w:rStyle w:val="Kpr"/>
@@ -257,7 +227,7 @@
           <w:szCs w:val="28"/>
         </w:rPr>
       </w:pPr>
-      <w:hyperlink r:id="rId9" w:history="1">
+      <w:hyperlink r:id="rId10" w:history="1">
         <w:r>
           <w:rPr>
             <w:rStyle w:val="Kpr"/>
@@ -322,9 +292,1007 @@
           <w:sz w:val="24"/>
           <w:szCs w:val="24"/>
         </w:rPr>
+      </w:pPr>
+      <w:r>
+        <w:rPr>
+          <w:rFonts w:ascii="Arial" w:hAnsi="Arial" w:cs="Arial"/>
+          <w:b/>
+          <w:sz w:val="24"/>
+          <w:szCs w:val="24"/>
+        </w:rPr>
+        <w:t>19</w:t>
+      </w:r>
+      <w:r>
+        <w:rPr>
+          <w:rFonts w:ascii="Arial" w:hAnsi="Arial" w:cs="Arial"/>
+          <w:b/>
+          <w:sz w:val="24"/>
+          <w:szCs w:val="24"/>
+        </w:rPr>
+        <w:t>.0</w:t>
+      </w:r>
+      <w:r>
+        <w:rPr>
+          <w:rFonts w:ascii="Arial" w:hAnsi="Arial" w:cs="Arial"/>
+          <w:b/>
+          <w:sz w:val="24"/>
+          <w:szCs w:val="24"/>
+        </w:rPr>
+        <w:t>4</w:t>
+      </w:r>
+      <w:r>
+        <w:rPr>
+          <w:rFonts w:ascii="Arial" w:hAnsi="Arial" w:cs="Arial"/>
+          <w:b/>
+          <w:sz w:val="24"/>
+          <w:szCs w:val="24"/>
+        </w:rPr>
+        <w:t>.202</w:t>
+      </w:r>
+      <w:r>
+        <w:rPr>
+          <w:rFonts w:ascii="Arial" w:hAnsi="Arial" w:cs="Arial"/>
+          <w:b/>
+          <w:sz w:val="24"/>
+          <w:szCs w:val="24"/>
+        </w:rPr>
+        <w:t>6</w:t>
+      </w:r>
+    </w:p>
+    <w:p>
+      <w:pPr>
+        <w:spacing w:after="360" w:line="278" w:lineRule="auto"/>
+        <w:jc w:val="center"/>
+        <w:rPr>
+          <w:rFonts w:ascii="Arial" w:hAnsi="Arial" w:cs="Arial"/>
+          <w:b/>
+          <w:sz w:val="24"/>
+          <w:szCs w:val="24"/>
+        </w:rPr>
+      </w:pPr>
+      <w:r>
+        <w:rPr>
+          <w:rFonts w:ascii="Arial" w:hAnsi="Arial" w:cs="Arial"/>
+          <w:b/>
+          <w:sz w:val="24"/>
+          <w:szCs w:val="24"/>
+        </w:rPr>
+        <w:br w:type="page"/>
+      </w:r>
+      <w:r>
+        <w:rPr>
+          <w:rFonts w:ascii="Arial" w:hAnsi="Arial" w:cs="Arial"/>
+          <w:b/>
+          <w:sz w:val="24"/>
+          <w:szCs w:val="24"/>
+        </w:rPr>
+        <w:lastRenderedPageBreak/>
+        <w:t>İÇİNDEKİLER</w:t>
+      </w:r>
+    </w:p>
+    <w:p>
+      <w:pPr>
+        <w:pStyle w:val="T1"/>
+        <w:rPr>
+          <w:rFonts w:asciiTheme="minorHAnsi" w:eastAsiaTheme="minorEastAsia" w:hAnsiTheme="minorHAnsi" w:cstheme="minorBidi"/>
+          <w:b w:val="0"/>
+          <w:noProof/>
+          <w:kern w:val="2"/>
+          <w:szCs w:val="24"/>
+          <w:lang w:eastAsia="tr-TR"/>
+          <w14:ligatures w14:val="standardContextual"/>
+        </w:rPr>
+      </w:pPr>
+      <w:r>
+        <w:rPr>
+          <w:rFonts w:cs="Arial"/>
+          <w:szCs w:val="24"/>
+        </w:rPr>
+        <w:fldChar w:fldCharType="begin"/>
+      </w:r>
+      <w:r>
+        <w:rPr>
+          <w:rFonts w:cs="Arial"/>
+          <w:szCs w:val="24"/>
+        </w:rPr>
+        <w:instrText xml:space="preserve"> TOC \o "1-3" \h \z \u </w:instrText>
+      </w:r>
+      <w:r>
+        <w:rPr>
+          <w:rFonts w:cs="Arial"/>
+          <w:szCs w:val="24"/>
+        </w:rPr>
+        <w:fldChar w:fldCharType="separate"/>
+      </w:r>
+      <w:hyperlink w:anchor="_Toc227526752" w:history="1">
+        <w:r>
+          <w:rPr>
+            <w:rStyle w:val="Kpr"/>
+            <w:bCs/>
+            <w:noProof/>
+          </w:rPr>
+          <w:t>1.</w:t>
+        </w:r>
+        <w:r>
+          <w:rPr>
+            <w:rFonts w:asciiTheme="minorHAnsi" w:eastAsiaTheme="minorEastAsia" w:hAnsiTheme="minorHAnsi" w:cstheme="minorBidi"/>
+            <w:b w:val="0"/>
+            <w:noProof/>
+            <w:kern w:val="2"/>
+            <w:szCs w:val="24"/>
+            <w:lang w:eastAsia="tr-TR"/>
+            <w14:ligatures w14:val="standardContextual"/>
+          </w:rPr>
+          <w:tab/>
+        </w:r>
+        <w:r>
+          <w:rPr>
+            <w:rStyle w:val="Kpr"/>
+            <w:noProof/>
+          </w:rPr>
+          <w:t>PROJE - 1: Veritabanı Performans Optimizasyonu ve İzleme</w:t>
+        </w:r>
+        <w:r>
+          <w:rPr>
+            <w:noProof/>
+            <w:webHidden/>
+          </w:rPr>
+          <w:tab/>
+        </w:r>
+        <w:r>
+          <w:rPr>
+            <w:noProof/>
+            <w:webHidden/>
+          </w:rPr>
+          <w:fldChar w:fldCharType="begin"/>
+        </w:r>
+        <w:r>
+          <w:rPr>
+            <w:noProof/>
+            <w:webHidden/>
+          </w:rPr>
+          <w:instrText xml:space="preserve"> PAGEREF _Toc227526752 \h </w:instrText>
+        </w:r>
+        <w:r>
+          <w:rPr>
+            <w:noProof/>
+            <w:webHidden/>
+          </w:rPr>
+        </w:r>
+        <w:r>
+          <w:rPr>
+            <w:noProof/>
+            <w:webHidden/>
+          </w:rPr>
+          <w:fldChar w:fldCharType="separate"/>
+        </w:r>
+        <w:r>
+          <w:rPr>
+            <w:noProof/>
+            <w:webHidden/>
+          </w:rPr>
+          <w:t>1</w:t>
+        </w:r>
+        <w:r>
+          <w:rPr>
+            <w:noProof/>
+            <w:webHidden/>
+          </w:rPr>
+          <w:fldChar w:fldCharType="end"/>
+        </w:r>
+      </w:hyperlink>
+    </w:p>
+    <w:p>
+      <w:pPr>
+        <w:pStyle w:val="T2"/>
+        <w:rPr>
+          <w:rFonts w:asciiTheme="minorHAnsi" w:eastAsiaTheme="minorEastAsia" w:hAnsiTheme="minorHAnsi" w:cstheme="minorBidi"/>
+          <w:noProof/>
+          <w:kern w:val="2"/>
+          <w:szCs w:val="24"/>
+          <w:lang w:eastAsia="tr-TR"/>
+          <w14:ligatures w14:val="standardContextual"/>
+        </w:rPr>
+      </w:pPr>
+      <w:hyperlink w:anchor="_Toc227526753" w:history="1">
+        <w:r>
+          <w:rPr>
+            <w:rStyle w:val="Kpr"/>
+            <w:noProof/>
+          </w:rPr>
+          <w:t>1.1.</w:t>
+        </w:r>
+        <w:r>
+          <w:rPr>
+            <w:rFonts w:asciiTheme="minorHAnsi" w:eastAsiaTheme="minorEastAsia" w:hAnsiTheme="minorHAnsi" w:cstheme="minorBidi"/>
+            <w:noProof/>
+            <w:kern w:val="2"/>
+            <w:szCs w:val="24"/>
+            <w:lang w:eastAsia="tr-TR"/>
+            <w14:ligatures w14:val="standardContextual"/>
+          </w:rPr>
+          <w:tab/>
+        </w:r>
+        <w:r>
+          <w:rPr>
+            <w:rStyle w:val="Kpr"/>
+            <w:noProof/>
+          </w:rPr>
+          <w:t>Veritabanı İzleme (Monitoring)</w:t>
+        </w:r>
+        <w:r>
+          <w:rPr>
+            <w:noProof/>
+            <w:webHidden/>
+          </w:rPr>
+          <w:tab/>
+        </w:r>
+        <w:r>
+          <w:rPr>
+            <w:noProof/>
+            <w:webHidden/>
+          </w:rPr>
+          <w:fldChar w:fldCharType="begin"/>
+        </w:r>
+        <w:r>
+          <w:rPr>
+            <w:noProof/>
+            <w:webHidden/>
+          </w:rPr>
+          <w:instrText xml:space="preserve"> PAGEREF _Toc227526753 \h </w:instrText>
+        </w:r>
+        <w:r>
+          <w:rPr>
+            <w:noProof/>
+            <w:webHidden/>
+          </w:rPr>
+        </w:r>
+        <w:r>
+          <w:rPr>
+            <w:noProof/>
+            <w:webHidden/>
+          </w:rPr>
+          <w:fldChar w:fldCharType="separate"/>
+        </w:r>
+        <w:r>
+          <w:rPr>
+            <w:noProof/>
+            <w:webHidden/>
+          </w:rPr>
+          <w:t>1</w:t>
+        </w:r>
+        <w:r>
+          <w:rPr>
+            <w:noProof/>
+            <w:webHidden/>
+          </w:rPr>
+          <w:fldChar w:fldCharType="end"/>
+        </w:r>
+      </w:hyperlink>
+    </w:p>
+    <w:p>
+      <w:pPr>
+        <w:pStyle w:val="T2"/>
+        <w:rPr>
+          <w:rFonts w:asciiTheme="minorHAnsi" w:eastAsiaTheme="minorEastAsia" w:hAnsiTheme="minorHAnsi" w:cstheme="minorBidi"/>
+          <w:noProof/>
+          <w:kern w:val="2"/>
+          <w:szCs w:val="24"/>
+          <w:lang w:eastAsia="tr-TR"/>
+          <w14:ligatures w14:val="standardContextual"/>
+        </w:rPr>
+      </w:pPr>
+      <w:hyperlink w:anchor="_Toc227526754" w:history="1">
+        <w:r>
+          <w:rPr>
+            <w:rStyle w:val="Kpr"/>
+            <w:noProof/>
+          </w:rPr>
+          <w:t>1.2.</w:t>
+        </w:r>
+        <w:r>
+          <w:rPr>
+            <w:rFonts w:asciiTheme="minorHAnsi" w:eastAsiaTheme="minorEastAsia" w:hAnsiTheme="minorHAnsi" w:cstheme="minorBidi"/>
+            <w:noProof/>
+            <w:kern w:val="2"/>
+            <w:szCs w:val="24"/>
+            <w:lang w:eastAsia="tr-TR"/>
+            <w14:ligatures w14:val="standardContextual"/>
+          </w:rPr>
+          <w:tab/>
+        </w:r>
+        <w:r>
+          <w:rPr>
+            <w:rStyle w:val="Kpr"/>
+            <w:noProof/>
+          </w:rPr>
+          <w:t>Sorgu İyileştirme ve İndeks Yönetimi (1 Milyon Veri Testi)</w:t>
+        </w:r>
+        <w:r>
+          <w:rPr>
+            <w:noProof/>
+            <w:webHidden/>
+          </w:rPr>
+          <w:tab/>
+        </w:r>
+        <w:r>
+          <w:rPr>
+            <w:noProof/>
+            <w:webHidden/>
+          </w:rPr>
+          <w:fldChar w:fldCharType="begin"/>
+        </w:r>
+        <w:r>
+          <w:rPr>
+            <w:noProof/>
+            <w:webHidden/>
+          </w:rPr>
+          <w:instrText xml:space="preserve"> PAGEREF _Toc227526754 \h </w:instrText>
+        </w:r>
+        <w:r>
+          <w:rPr>
+            <w:noProof/>
+            <w:webHidden/>
+          </w:rPr>
+        </w:r>
+        <w:r>
+          <w:rPr>
+            <w:noProof/>
+            <w:webHidden/>
+          </w:rPr>
+          <w:fldChar w:fldCharType="separate"/>
+        </w:r>
+        <w:r>
+          <w:rPr>
+            <w:noProof/>
+            <w:webHidden/>
+          </w:rPr>
+          <w:t>1</w:t>
+        </w:r>
+        <w:r>
+          <w:rPr>
+            <w:noProof/>
+            <w:webHidden/>
+          </w:rPr>
+          <w:fldChar w:fldCharType="end"/>
+        </w:r>
+      </w:hyperlink>
+    </w:p>
+    <w:p>
+      <w:pPr>
+        <w:pStyle w:val="T2"/>
+        <w:rPr>
+          <w:rFonts w:asciiTheme="minorHAnsi" w:eastAsiaTheme="minorEastAsia" w:hAnsiTheme="minorHAnsi" w:cstheme="minorBidi"/>
+          <w:noProof/>
+          <w:kern w:val="2"/>
+          <w:szCs w:val="24"/>
+          <w:lang w:eastAsia="tr-TR"/>
+          <w14:ligatures w14:val="standardContextual"/>
+        </w:rPr>
+      </w:pPr>
+      <w:hyperlink w:anchor="_Toc227526755" w:history="1">
+        <w:r>
+          <w:rPr>
+            <w:rStyle w:val="Kpr"/>
+            <w:noProof/>
+          </w:rPr>
+          <w:t>1.3.</w:t>
+        </w:r>
+        <w:r>
+          <w:rPr>
+            <w:rFonts w:asciiTheme="minorHAnsi" w:eastAsiaTheme="minorEastAsia" w:hAnsiTheme="minorHAnsi" w:cstheme="minorBidi"/>
+            <w:noProof/>
+            <w:kern w:val="2"/>
+            <w:szCs w:val="24"/>
+            <w:lang w:eastAsia="tr-TR"/>
+            <w14:ligatures w14:val="standardContextual"/>
+          </w:rPr>
+          <w:tab/>
+        </w:r>
+        <w:r>
+          <w:rPr>
+            <w:rStyle w:val="Kpr"/>
+            <w:noProof/>
+          </w:rPr>
+          <w:t>Disk Alanı Yönetimi</w:t>
+        </w:r>
+        <w:r>
+          <w:rPr>
+            <w:noProof/>
+            <w:webHidden/>
+          </w:rPr>
+          <w:tab/>
+        </w:r>
+        <w:r>
+          <w:rPr>
+            <w:noProof/>
+            <w:webHidden/>
+          </w:rPr>
+          <w:fldChar w:fldCharType="begin"/>
+        </w:r>
+        <w:r>
+          <w:rPr>
+            <w:noProof/>
+            <w:webHidden/>
+          </w:rPr>
+          <w:instrText xml:space="preserve"> PAGEREF _Toc227526755 \h </w:instrText>
+        </w:r>
+        <w:r>
+          <w:rPr>
+            <w:noProof/>
+            <w:webHidden/>
+          </w:rPr>
+        </w:r>
+        <w:r>
+          <w:rPr>
+            <w:noProof/>
+            <w:webHidden/>
+          </w:rPr>
+          <w:fldChar w:fldCharType="separate"/>
+        </w:r>
+        <w:r>
+          <w:rPr>
+            <w:noProof/>
+            <w:webHidden/>
+          </w:rPr>
+          <w:t>2</w:t>
+        </w:r>
+        <w:r>
+          <w:rPr>
+            <w:noProof/>
+            <w:webHidden/>
+          </w:rPr>
+          <w:fldChar w:fldCharType="end"/>
+        </w:r>
+      </w:hyperlink>
+    </w:p>
+    <w:p>
+      <w:pPr>
+        <w:pStyle w:val="T2"/>
+        <w:rPr>
+          <w:rFonts w:asciiTheme="minorHAnsi" w:eastAsiaTheme="minorEastAsia" w:hAnsiTheme="minorHAnsi" w:cstheme="minorBidi"/>
+          <w:noProof/>
+          <w:kern w:val="2"/>
+          <w:szCs w:val="24"/>
+          <w:lang w:eastAsia="tr-TR"/>
+          <w14:ligatures w14:val="standardContextual"/>
+        </w:rPr>
+      </w:pPr>
+      <w:hyperlink w:anchor="_Toc227526756" w:history="1">
+        <w:r>
+          <w:rPr>
+            <w:rStyle w:val="Kpr"/>
+            <w:noProof/>
+          </w:rPr>
+          <w:t>1.4.</w:t>
+        </w:r>
+        <w:r>
+          <w:rPr>
+            <w:rFonts w:asciiTheme="minorHAnsi" w:eastAsiaTheme="minorEastAsia" w:hAnsiTheme="minorHAnsi" w:cstheme="minorBidi"/>
+            <w:noProof/>
+            <w:kern w:val="2"/>
+            <w:szCs w:val="24"/>
+            <w:lang w:eastAsia="tr-TR"/>
+            <w14:ligatures w14:val="standardContextual"/>
+          </w:rPr>
+          <w:tab/>
+        </w:r>
+        <w:r>
+          <w:rPr>
+            <w:rStyle w:val="Kpr"/>
+            <w:noProof/>
+          </w:rPr>
+          <w:t>Erişim Yönetimi ve Veri Yöneticisi Rolleri</w:t>
+        </w:r>
+        <w:r>
+          <w:rPr>
+            <w:noProof/>
+            <w:webHidden/>
+          </w:rPr>
+          <w:tab/>
+        </w:r>
+        <w:r>
+          <w:rPr>
+            <w:noProof/>
+            <w:webHidden/>
+          </w:rPr>
+          <w:fldChar w:fldCharType="begin"/>
+        </w:r>
+        <w:r>
+          <w:rPr>
+            <w:noProof/>
+            <w:webHidden/>
+          </w:rPr>
+          <w:instrText xml:space="preserve"> PAGEREF _Toc227526756 \h </w:instrText>
+        </w:r>
+        <w:r>
+          <w:rPr>
+            <w:noProof/>
+            <w:webHidden/>
+          </w:rPr>
+        </w:r>
+        <w:r>
+          <w:rPr>
+            <w:noProof/>
+            <w:webHidden/>
+          </w:rPr>
+          <w:fldChar w:fldCharType="separate"/>
+        </w:r>
+        <w:r>
+          <w:rPr>
+            <w:noProof/>
+            <w:webHidden/>
+          </w:rPr>
+          <w:t>2</w:t>
+        </w:r>
+        <w:r>
+          <w:rPr>
+            <w:noProof/>
+            <w:webHidden/>
+          </w:rPr>
+          <w:fldChar w:fldCharType="end"/>
+        </w:r>
+      </w:hyperlink>
+    </w:p>
+    <w:p>
+      <w:pPr>
+        <w:pStyle w:val="T1"/>
+        <w:rPr>
+          <w:rFonts w:asciiTheme="minorHAnsi" w:eastAsiaTheme="minorEastAsia" w:hAnsiTheme="minorHAnsi" w:cstheme="minorBidi"/>
+          <w:b w:val="0"/>
+          <w:noProof/>
+          <w:kern w:val="2"/>
+          <w:szCs w:val="24"/>
+          <w:lang w:eastAsia="tr-TR"/>
+          <w14:ligatures w14:val="standardContextual"/>
+        </w:rPr>
+      </w:pPr>
+      <w:hyperlink w:anchor="_Toc227526757" w:history="1">
+        <w:r>
+          <w:rPr>
+            <w:rStyle w:val="Kpr"/>
+            <w:bCs/>
+            <w:noProof/>
+          </w:rPr>
+          <w:t>2.</w:t>
+        </w:r>
+        <w:r>
+          <w:rPr>
+            <w:rFonts w:asciiTheme="minorHAnsi" w:eastAsiaTheme="minorEastAsia" w:hAnsiTheme="minorHAnsi" w:cstheme="minorBidi"/>
+            <w:b w:val="0"/>
+            <w:noProof/>
+            <w:kern w:val="2"/>
+            <w:szCs w:val="24"/>
+            <w:lang w:eastAsia="tr-TR"/>
+            <w14:ligatures w14:val="standardContextual"/>
+          </w:rPr>
+          <w:tab/>
+        </w:r>
+        <w:r>
+          <w:rPr>
+            <w:rStyle w:val="Kpr"/>
+            <w:noProof/>
+          </w:rPr>
+          <w:t>PROJE - 2: Veritabanı Yedekleme ve Kurtarma Stratejileri</w:t>
+        </w:r>
+        <w:r>
+          <w:rPr>
+            <w:noProof/>
+            <w:webHidden/>
+          </w:rPr>
+          <w:tab/>
+        </w:r>
+        <w:r>
+          <w:rPr>
+            <w:noProof/>
+            <w:webHidden/>
+          </w:rPr>
+          <w:fldChar w:fldCharType="begin"/>
+        </w:r>
+        <w:r>
+          <w:rPr>
+            <w:noProof/>
+            <w:webHidden/>
+          </w:rPr>
+          <w:instrText xml:space="preserve"> PAGEREF _Toc227526757 \h </w:instrText>
+        </w:r>
+        <w:r>
+          <w:rPr>
+            <w:noProof/>
+            <w:webHidden/>
+          </w:rPr>
+        </w:r>
+        <w:r>
+          <w:rPr>
+            <w:noProof/>
+            <w:webHidden/>
+          </w:rPr>
+          <w:fldChar w:fldCharType="separate"/>
+        </w:r>
+        <w:r>
+          <w:rPr>
+            <w:noProof/>
+            <w:webHidden/>
+          </w:rPr>
+          <w:t>3</w:t>
+        </w:r>
+        <w:r>
+          <w:rPr>
+            <w:noProof/>
+            <w:webHidden/>
+          </w:rPr>
+          <w:fldChar w:fldCharType="end"/>
+        </w:r>
+      </w:hyperlink>
+    </w:p>
+    <w:p>
+      <w:pPr>
+        <w:pStyle w:val="T2"/>
+        <w:rPr>
+          <w:rFonts w:asciiTheme="minorHAnsi" w:eastAsiaTheme="minorEastAsia" w:hAnsiTheme="minorHAnsi" w:cstheme="minorBidi"/>
+          <w:noProof/>
+          <w:kern w:val="2"/>
+          <w:szCs w:val="24"/>
+          <w:lang w:eastAsia="tr-TR"/>
+          <w14:ligatures w14:val="standardContextual"/>
+        </w:rPr>
+      </w:pPr>
+      <w:hyperlink w:anchor="_Toc227526758" w:history="1">
+        <w:r>
+          <w:rPr>
+            <w:rStyle w:val="Kpr"/>
+            <w:rFonts w:ascii="Times New Roman" w:eastAsia="Times New Roman" w:hAnsi="Times New Roman"/>
+            <w:noProof/>
+          </w:rPr>
+          <w:t>2.1.</w:t>
+        </w:r>
+        <w:r>
+          <w:rPr>
+            <w:rFonts w:asciiTheme="minorHAnsi" w:eastAsiaTheme="minorEastAsia" w:hAnsiTheme="minorHAnsi" w:cstheme="minorBidi"/>
+            <w:noProof/>
+            <w:kern w:val="2"/>
+            <w:szCs w:val="24"/>
+            <w:lang w:eastAsia="tr-TR"/>
+            <w14:ligatures w14:val="standardContextual"/>
+          </w:rPr>
+          <w:tab/>
+        </w:r>
+        <w:r>
+          <w:rPr>
+            <w:rStyle w:val="Kpr"/>
+            <w:noProof/>
+          </w:rPr>
+          <w:t>Uygulamalı Yedekleme ve Kurtarma Senaryosu</w:t>
+        </w:r>
+        <w:r>
+          <w:rPr>
+            <w:noProof/>
+            <w:webHidden/>
+          </w:rPr>
+          <w:tab/>
+        </w:r>
+        <w:r>
+          <w:rPr>
+            <w:noProof/>
+            <w:webHidden/>
+          </w:rPr>
+          <w:fldChar w:fldCharType="begin"/>
+        </w:r>
+        <w:r>
+          <w:rPr>
+            <w:noProof/>
+            <w:webHidden/>
+          </w:rPr>
+          <w:instrText xml:space="preserve"> PAGEREF _Toc227526758 \h </w:instrText>
+        </w:r>
+        <w:r>
+          <w:rPr>
+            <w:noProof/>
+            <w:webHidden/>
+          </w:rPr>
+        </w:r>
+        <w:r>
+          <w:rPr>
+            <w:noProof/>
+            <w:webHidden/>
+          </w:rPr>
+          <w:fldChar w:fldCharType="separate"/>
+        </w:r>
+        <w:r>
+          <w:rPr>
+            <w:noProof/>
+            <w:webHidden/>
+          </w:rPr>
+          <w:t>3</w:t>
+        </w:r>
+        <w:r>
+          <w:rPr>
+            <w:noProof/>
+            <w:webHidden/>
+          </w:rPr>
+          <w:fldChar w:fldCharType="end"/>
+        </w:r>
+      </w:hyperlink>
+    </w:p>
+    <w:p>
+      <w:pPr>
+        <w:pStyle w:val="T2"/>
+        <w:rPr>
+          <w:rFonts w:asciiTheme="minorHAnsi" w:eastAsiaTheme="minorEastAsia" w:hAnsiTheme="minorHAnsi" w:cstheme="minorBidi"/>
+          <w:noProof/>
+          <w:kern w:val="2"/>
+          <w:szCs w:val="24"/>
+          <w:lang w:eastAsia="tr-TR"/>
+          <w14:ligatures w14:val="standardContextual"/>
+        </w:rPr>
+      </w:pPr>
+      <w:hyperlink w:anchor="_Toc227526759" w:history="1">
+        <w:r>
+          <w:rPr>
+            <w:rStyle w:val="Kpr"/>
+            <w:noProof/>
+          </w:rPr>
+          <w:t>2.2.</w:t>
+        </w:r>
+        <w:r>
+          <w:rPr>
+            <w:rFonts w:asciiTheme="minorHAnsi" w:eastAsiaTheme="minorEastAsia" w:hAnsiTheme="minorHAnsi" w:cstheme="minorBidi"/>
+            <w:noProof/>
+            <w:kern w:val="2"/>
+            <w:szCs w:val="24"/>
+            <w:lang w:eastAsia="tr-TR"/>
+            <w14:ligatures w14:val="standardContextual"/>
+          </w:rPr>
+          <w:tab/>
+        </w:r>
+        <w:r>
+          <w:rPr>
+            <w:rStyle w:val="Kpr"/>
+            <w:noProof/>
+          </w:rPr>
+          <w:t>Kısıtlı Ortamlarda Yedekleme Otomasyonu (Custom Automation)</w:t>
+        </w:r>
+        <w:r>
+          <w:rPr>
+            <w:noProof/>
+            <w:webHidden/>
+          </w:rPr>
+          <w:tab/>
+        </w:r>
+        <w:r>
+          <w:rPr>
+            <w:noProof/>
+            <w:webHidden/>
+          </w:rPr>
+          <w:fldChar w:fldCharType="begin"/>
+        </w:r>
+        <w:r>
+          <w:rPr>
+            <w:noProof/>
+            <w:webHidden/>
+          </w:rPr>
+          <w:instrText xml:space="preserve"> PAGEREF _Toc227526759 \h </w:instrText>
+        </w:r>
+        <w:r>
+          <w:rPr>
+            <w:noProof/>
+            <w:webHidden/>
+          </w:rPr>
+        </w:r>
+        <w:r>
+          <w:rPr>
+            <w:noProof/>
+            <w:webHidden/>
+          </w:rPr>
+          <w:fldChar w:fldCharType="separate"/>
+        </w:r>
+        <w:r>
+          <w:rPr>
+            <w:noProof/>
+            <w:webHidden/>
+          </w:rPr>
+          <w:t>4</w:t>
+        </w:r>
+        <w:r>
+          <w:rPr>
+            <w:noProof/>
+            <w:webHidden/>
+          </w:rPr>
+          <w:fldChar w:fldCharType="end"/>
+        </w:r>
+      </w:hyperlink>
+    </w:p>
+    <w:p>
+      <w:pPr>
+        <w:pStyle w:val="T2"/>
+        <w:rPr>
+          <w:rFonts w:asciiTheme="minorHAnsi" w:eastAsiaTheme="minorEastAsia" w:hAnsiTheme="minorHAnsi" w:cstheme="minorBidi"/>
+          <w:noProof/>
+          <w:kern w:val="2"/>
+          <w:szCs w:val="24"/>
+          <w:lang w:eastAsia="tr-TR"/>
+          <w14:ligatures w14:val="standardContextual"/>
+        </w:rPr>
+      </w:pPr>
+      <w:hyperlink w:anchor="_Toc227526760" w:history="1">
+        <w:r>
+          <w:rPr>
+            <w:rStyle w:val="Kpr"/>
+            <w:rFonts w:ascii="Times New Roman" w:eastAsia="Times New Roman" w:hAnsi="Times New Roman"/>
+            <w:noProof/>
+          </w:rPr>
+          <w:t>2.3.</w:t>
+        </w:r>
+        <w:r>
+          <w:rPr>
+            <w:rFonts w:asciiTheme="minorHAnsi" w:eastAsiaTheme="minorEastAsia" w:hAnsiTheme="minorHAnsi" w:cstheme="minorBidi"/>
+            <w:noProof/>
+            <w:kern w:val="2"/>
+            <w:szCs w:val="24"/>
+            <w:lang w:eastAsia="tr-TR"/>
+            <w14:ligatures w14:val="standardContextual"/>
+          </w:rPr>
+          <w:tab/>
+        </w:r>
+        <w:r>
+          <w:rPr>
+            <w:rStyle w:val="Kpr"/>
+            <w:noProof/>
+          </w:rPr>
+          <w:t>Olağanüstü Durum Kurtarma: Point-in-Time Restore</w:t>
+        </w:r>
+        <w:r>
+          <w:rPr>
+            <w:noProof/>
+            <w:webHidden/>
+          </w:rPr>
+          <w:tab/>
+        </w:r>
+        <w:r>
+          <w:rPr>
+            <w:noProof/>
+            <w:webHidden/>
+          </w:rPr>
+          <w:fldChar w:fldCharType="begin"/>
+        </w:r>
+        <w:r>
+          <w:rPr>
+            <w:noProof/>
+            <w:webHidden/>
+          </w:rPr>
+          <w:instrText xml:space="preserve"> PAGEREF _Toc227526760 \h </w:instrText>
+        </w:r>
+        <w:r>
+          <w:rPr>
+            <w:noProof/>
+            <w:webHidden/>
+          </w:rPr>
+        </w:r>
+        <w:r>
+          <w:rPr>
+            <w:noProof/>
+            <w:webHidden/>
+          </w:rPr>
+          <w:fldChar w:fldCharType="separate"/>
+        </w:r>
+        <w:r>
+          <w:rPr>
+            <w:noProof/>
+            <w:webHidden/>
+          </w:rPr>
+          <w:t>5</w:t>
+        </w:r>
+        <w:r>
+          <w:rPr>
+            <w:noProof/>
+            <w:webHidden/>
+          </w:rPr>
+          <w:fldChar w:fldCharType="end"/>
+        </w:r>
+      </w:hyperlink>
+    </w:p>
+    <w:p>
+      <w:pPr>
+        <w:pStyle w:val="T2"/>
+        <w:rPr>
+          <w:rFonts w:asciiTheme="minorHAnsi" w:eastAsiaTheme="minorEastAsia" w:hAnsiTheme="minorHAnsi" w:cstheme="minorBidi"/>
+          <w:noProof/>
+          <w:kern w:val="2"/>
+          <w:szCs w:val="24"/>
+          <w:lang w:eastAsia="tr-TR"/>
+          <w14:ligatures w14:val="standardContextual"/>
+        </w:rPr>
+      </w:pPr>
+      <w:hyperlink w:anchor="_Toc227526761" w:history="1">
+        <w:r>
+          <w:rPr>
+            <w:rStyle w:val="Kpr"/>
+            <w:noProof/>
+          </w:rPr>
+          <w:t>2.4.</w:t>
+        </w:r>
+        <w:r>
+          <w:rPr>
+            <w:rFonts w:asciiTheme="minorHAnsi" w:eastAsiaTheme="minorEastAsia" w:hAnsiTheme="minorHAnsi" w:cstheme="minorBidi"/>
+            <w:noProof/>
+            <w:kern w:val="2"/>
+            <w:szCs w:val="24"/>
+            <w:lang w:eastAsia="tr-TR"/>
+            <w14:ligatures w14:val="standardContextual"/>
+          </w:rPr>
+          <w:tab/>
+        </w:r>
+        <w:r>
+          <w:rPr>
+            <w:rStyle w:val="Kpr"/>
+            <w:noProof/>
+          </w:rPr>
+          <w:t>Veri Doğrulama (Verify)</w:t>
+        </w:r>
+        <w:r>
+          <w:rPr>
+            <w:noProof/>
+            <w:webHidden/>
+          </w:rPr>
+          <w:tab/>
+        </w:r>
+        <w:r>
+          <w:rPr>
+            <w:noProof/>
+            <w:webHidden/>
+          </w:rPr>
+          <w:fldChar w:fldCharType="begin"/>
+        </w:r>
+        <w:r>
+          <w:rPr>
+            <w:noProof/>
+            <w:webHidden/>
+          </w:rPr>
+          <w:instrText xml:space="preserve"> PAGEREF _Toc227526761 \h </w:instrText>
+        </w:r>
+        <w:r>
+          <w:rPr>
+            <w:noProof/>
+            <w:webHidden/>
+          </w:rPr>
+        </w:r>
+        <w:r>
+          <w:rPr>
+            <w:noProof/>
+            <w:webHidden/>
+          </w:rPr>
+          <w:fldChar w:fldCharType="separate"/>
+        </w:r>
+        <w:r>
+          <w:rPr>
+            <w:noProof/>
+            <w:webHidden/>
+          </w:rPr>
+          <w:t>5</w:t>
+        </w:r>
+        <w:r>
+          <w:rPr>
+            <w:noProof/>
+            <w:webHidden/>
+          </w:rPr>
+          <w:fldChar w:fldCharType="end"/>
+        </w:r>
+      </w:hyperlink>
+    </w:p>
+    <w:p>
+      <w:pPr>
+        <w:spacing w:after="160" w:line="278" w:lineRule="auto"/>
+        <w:rPr>
+          <w:rFonts w:ascii="Arial" w:hAnsi="Arial" w:cs="Arial"/>
+          <w:b/>
+          <w:sz w:val="24"/>
+          <w:szCs w:val="24"/>
+        </w:rPr>
         <w:sectPr>
+          <w:footerReference w:type="default" r:id="rId11"/>
           <w:pgSz w:w="11906" w:h="16838" w:code="9"/>
-          <w:pgMar w:top="1418" w:right="1134" w:bottom="1418" w:left="1701" w:header="709" w:footer="709" w:gutter="0"/>
+          <w:pgMar w:top="1417" w:right="1417" w:bottom="1417" w:left="1417" w:header="709" w:footer="709" w:gutter="0"/>
+          <w:pgNumType w:fmt="lowerRoman" w:start="1"/>
           <w:cols w:space="708"/>
           <w:docGrid w:linePitch="360"/>
         </w:sectPr>
@@ -332,57 +1300,32 @@
       <w:r>
         <w:rPr>
           <w:rFonts w:ascii="Arial" w:hAnsi="Arial" w:cs="Arial"/>
-          <w:b/>
-          <w:sz w:val="24"/>
-          <w:szCs w:val="24"/>
-        </w:rPr>
-        <w:t>19</w:t>
-      </w:r>
-      <w:r>
-        <w:rPr>
-          <w:rFonts w:ascii="Arial" w:hAnsi="Arial" w:cs="Arial"/>
-          <w:b/>
-          <w:sz w:val="24"/>
-          <w:szCs w:val="24"/>
-        </w:rPr>
-        <w:t>.0</w:t>
-      </w:r>
-      <w:r>
-        <w:rPr>
-          <w:rFonts w:ascii="Arial" w:hAnsi="Arial" w:cs="Arial"/>
-          <w:b/>
-          <w:sz w:val="24"/>
-          <w:szCs w:val="24"/>
-        </w:rPr>
-        <w:t>4</w:t>
-      </w:r>
-      <w:r>
-        <w:rPr>
-          <w:rFonts w:ascii="Arial" w:hAnsi="Arial" w:cs="Arial"/>
-          <w:b/>
-          <w:sz w:val="24"/>
-          <w:szCs w:val="24"/>
-        </w:rPr>
-        <w:t>.202</w:t>
-      </w:r>
-      <w:r>
-        <w:rPr>
-          <w:rFonts w:ascii="Arial" w:hAnsi="Arial" w:cs="Arial"/>
-          <w:b/>
-          <w:sz w:val="24"/>
-          <w:szCs w:val="24"/>
-        </w:rPr>
-        <w:t>6</w:t>
-      </w:r>
-    </w:p>
-    <w:p>
-      <w:pPr>
-        <w:pStyle w:val="Stil1"/>
+          <w:sz w:val="24"/>
+          <w:szCs w:val="24"/>
+        </w:rPr>
+        <w:fldChar w:fldCharType="end"/>
+      </w:r>
+      <w:r>
+        <w:rPr>
+          <w:rFonts w:ascii="Arial" w:hAnsi="Arial" w:cs="Arial"/>
+          <w:sz w:val="24"/>
+          <w:szCs w:val="24"/>
+        </w:rPr>
+        <w:tab/>
+      </w:r>
+    </w:p>
+    <w:p>
+      <w:pPr>
+        <w:pStyle w:val="Balk1"/>
       </w:pPr>
       <w:r>
         <w:lastRenderedPageBreak/>
         <w:t xml:space="preserve"> </w:t>
       </w:r>
+      <w:bookmarkStart w:id="0" w:name="_Toc227525508"/>
+      <w:bookmarkStart w:id="1" w:name="_Toc227525526"/>
+      <w:bookmarkStart w:id="2" w:name="_Toc227526663"/>
+      <w:bookmarkStart w:id="3" w:name="_Toc227526752"/>
       <w:proofErr w:type="gramStart"/>
       <w:r>
         <w:t>PROJE</w:t>
@@ -405,12 +1348,19 @@
       <w:r>
         <w:t xml:space="preserve"> Performans Optimizasyonu ve İzleme</w:t>
       </w:r>
-    </w:p>
-    <w:p>
-      <w:pPr>
-        <w:pStyle w:val="Stil2"/>
-        <w:jc w:val="both"/>
-      </w:pPr>
+      <w:bookmarkEnd w:id="0"/>
+      <w:bookmarkEnd w:id="1"/>
+      <w:bookmarkEnd w:id="2"/>
+      <w:bookmarkEnd w:id="3"/>
+    </w:p>
+    <w:p>
+      <w:pPr>
+        <w:pStyle w:val="Balk2"/>
+      </w:pPr>
+      <w:bookmarkStart w:id="4" w:name="_Toc227525509"/>
+      <w:bookmarkStart w:id="5" w:name="_Toc227525527"/>
+      <w:bookmarkStart w:id="6" w:name="_Toc227526664"/>
+      <w:bookmarkStart w:id="7" w:name="_Toc227526753"/>
       <w:proofErr w:type="spellStart"/>
       <w:r>
         <w:t>Veritabanı</w:t>
@@ -427,6 +1377,10 @@
       <w:r>
         <w:t>)</w:t>
       </w:r>
+      <w:bookmarkEnd w:id="4"/>
+      <w:bookmarkEnd w:id="5"/>
+      <w:bookmarkEnd w:id="6"/>
+      <w:bookmarkEnd w:id="7"/>
     </w:p>
     <w:p>
       <w:pPr>
@@ -532,7 +1486,7 @@
                     <pic:cNvPicPr/>
                   </pic:nvPicPr>
                   <pic:blipFill>
-                    <a:blip r:embed="rId10"/>
+                    <a:blip r:embed="rId12"/>
                     <a:stretch>
                       <a:fillRect/>
                     </a:stretch>
@@ -555,11 +1509,19 @@
     </w:p>
     <w:p>
       <w:pPr>
-        <w:pStyle w:val="Stil2"/>
-      </w:pPr>
+        <w:pStyle w:val="Balk2"/>
+      </w:pPr>
+      <w:bookmarkStart w:id="8" w:name="_Toc227525510"/>
+      <w:bookmarkStart w:id="9" w:name="_Toc227525528"/>
+      <w:bookmarkStart w:id="10" w:name="_Toc227526665"/>
+      <w:bookmarkStart w:id="11" w:name="_Toc227526754"/>
       <w:r>
         <w:t>Sorgu İyileştirme ve İndeks Yönetimi (1 Milyon Veri Testi)</w:t>
       </w:r>
+      <w:bookmarkEnd w:id="8"/>
+      <w:bookmarkEnd w:id="9"/>
+      <w:bookmarkEnd w:id="10"/>
+      <w:bookmarkEnd w:id="11"/>
     </w:p>
     <w:p>
       <w:pPr>
@@ -631,7 +1593,7 @@
                     <pic:cNvPicPr/>
                   </pic:nvPicPr>
                   <pic:blipFill>
-                    <a:blip r:embed="rId11"/>
+                    <a:blip r:embed="rId13"/>
                     <a:stretch>
                       <a:fillRect/>
                     </a:stretch>
@@ -807,7 +1769,7 @@
                     </pic:cNvPicPr>
                   </pic:nvPicPr>
                   <pic:blipFill>
-                    <a:blip r:embed="rId12">
+                    <a:blip r:embed="rId14">
                       <a:extLst>
                         <a:ext uri="{28A0092B-C50C-407E-A947-70E740481C1C}">
                           <a14:useLocalDpi xmlns:a14="http://schemas.microsoft.com/office/drawing/2010/main" val="0"/>
@@ -991,7 +1953,7 @@
                     </pic:cNvPicPr>
                   </pic:nvPicPr>
                   <pic:blipFill>
-                    <a:blip r:embed="rId13">
+                    <a:blip r:embed="rId15">
                       <a:extLst>
                         <a:ext uri="{28A0092B-C50C-407E-A947-70E740481C1C}">
                           <a14:useLocalDpi xmlns:a14="http://schemas.microsoft.com/office/drawing/2010/main" val="0"/>
@@ -1126,11 +2088,19 @@
     </w:p>
     <w:p>
       <w:pPr>
-        <w:pStyle w:val="Stil2"/>
-      </w:pPr>
+        <w:pStyle w:val="Balk2"/>
+      </w:pPr>
+      <w:bookmarkStart w:id="12" w:name="_Toc227525511"/>
+      <w:bookmarkStart w:id="13" w:name="_Toc227525529"/>
+      <w:bookmarkStart w:id="14" w:name="_Toc227526666"/>
+      <w:bookmarkStart w:id="15" w:name="_Toc227526755"/>
       <w:r>
         <w:t>Disk Alanı Yönetimi</w:t>
       </w:r>
+      <w:bookmarkEnd w:id="12"/>
+      <w:bookmarkEnd w:id="13"/>
+      <w:bookmarkEnd w:id="14"/>
+      <w:bookmarkEnd w:id="15"/>
     </w:p>
     <w:p>
       <w:pPr>
@@ -1258,7 +2228,7 @@
                     </pic:cNvPicPr>
                   </pic:nvPicPr>
                   <pic:blipFill>
-                    <a:blip r:embed="rId14">
+                    <a:blip r:embed="rId16">
                       <a:extLst>
                         <a:ext uri="{28A0092B-C50C-407E-A947-70E740481C1C}">
                           <a14:useLocalDpi xmlns:a14="http://schemas.microsoft.com/office/drawing/2010/main" val="0"/>
@@ -1363,11 +2333,19 @@
     </w:p>
     <w:p>
       <w:pPr>
-        <w:pStyle w:val="Stil2"/>
-      </w:pPr>
+        <w:pStyle w:val="Balk2"/>
+      </w:pPr>
+      <w:bookmarkStart w:id="16" w:name="_Toc227525512"/>
+      <w:bookmarkStart w:id="17" w:name="_Toc227525530"/>
+      <w:bookmarkStart w:id="18" w:name="_Toc227526667"/>
+      <w:bookmarkStart w:id="19" w:name="_Toc227526756"/>
       <w:r>
         <w:t>Erişim Yönetimi ve Veri Yöneticisi Rolleri</w:t>
       </w:r>
+      <w:bookmarkEnd w:id="16"/>
+      <w:bookmarkEnd w:id="17"/>
+      <w:bookmarkEnd w:id="18"/>
+      <w:bookmarkEnd w:id="19"/>
     </w:p>
     <w:p>
       <w:pPr>
@@ -1458,7 +2436,7 @@
                     <pic:cNvPicPr/>
                   </pic:nvPicPr>
                   <pic:blipFill>
-                    <a:blip r:embed="rId15"/>
+                    <a:blip r:embed="rId17"/>
                     <a:stretch>
                       <a:fillRect/>
                     </a:stretch>
@@ -1536,8 +2514,12 @@
     </w:p>
     <w:p>
       <w:pPr>
-        <w:pStyle w:val="Stil1"/>
-      </w:pPr>
+        <w:pStyle w:val="Balk1"/>
+      </w:pPr>
+      <w:bookmarkStart w:id="20" w:name="_Toc227525513"/>
+      <w:bookmarkStart w:id="21" w:name="_Toc227525531"/>
+      <w:bookmarkStart w:id="22" w:name="_Toc227526668"/>
+      <w:bookmarkStart w:id="23" w:name="_Toc227526757"/>
       <w:proofErr w:type="gramStart"/>
       <w:r>
         <w:t>PROJE</w:t>
@@ -1560,20 +2542,31 @@
       <w:r>
         <w:t xml:space="preserve"> Yedekleme ve Kurtarma Stratejileri</w:t>
       </w:r>
-    </w:p>
-    <w:p>
-      <w:pPr>
-        <w:pStyle w:val="Stil2"/>
-        <w:jc w:val="both"/>
+      <w:bookmarkEnd w:id="20"/>
+      <w:bookmarkEnd w:id="21"/>
+      <w:bookmarkEnd w:id="22"/>
+      <w:bookmarkEnd w:id="23"/>
+    </w:p>
+    <w:p>
+      <w:pPr>
+        <w:pStyle w:val="Balk2"/>
         <w:rPr>
           <w:rFonts w:ascii="Times New Roman" w:eastAsia="Times New Roman" w:hAnsi="Times New Roman"/>
           <w:sz w:val="27"/>
           <w:szCs w:val="27"/>
         </w:rPr>
       </w:pPr>
+      <w:bookmarkStart w:id="24" w:name="_Toc227525514"/>
+      <w:bookmarkStart w:id="25" w:name="_Toc227525532"/>
+      <w:bookmarkStart w:id="26" w:name="_Toc227526669"/>
+      <w:bookmarkStart w:id="27" w:name="_Toc227526758"/>
       <w:r>
         <w:t>Uygulamalı Yedekleme ve Kurtarma Senaryosu</w:t>
       </w:r>
+      <w:bookmarkEnd w:id="24"/>
+      <w:bookmarkEnd w:id="25"/>
+      <w:bookmarkEnd w:id="26"/>
+      <w:bookmarkEnd w:id="27"/>
     </w:p>
     <w:p>
       <w:pPr>
@@ -1701,7 +2694,7 @@
                     </pic:cNvPicPr>
                   </pic:nvPicPr>
                   <pic:blipFill>
-                    <a:blip r:embed="rId16">
+                    <a:blip r:embed="rId18">
                       <a:extLst>
                         <a:ext uri="{28A0092B-C50C-407E-A947-70E740481C1C}">
                           <a14:useLocalDpi xmlns:a14="http://schemas.microsoft.com/office/drawing/2010/main" val="0"/>
@@ -1852,7 +2845,7 @@
                     </pic:cNvPicPr>
                   </pic:nvPicPr>
                   <pic:blipFill>
-                    <a:blip r:embed="rId17">
+                    <a:blip r:embed="rId19">
                       <a:extLst>
                         <a:ext uri="{28A0092B-C50C-407E-A947-70E740481C1C}">
                           <a14:useLocalDpi xmlns:a14="http://schemas.microsoft.com/office/drawing/2010/main" val="0"/>
@@ -1984,7 +2977,7 @@
                     <pic:cNvPicPr/>
                   </pic:nvPicPr>
                   <pic:blipFill>
-                    <a:blip r:embed="rId18"/>
+                    <a:blip r:embed="rId20"/>
                     <a:stretch>
                       <a:fillRect/>
                     </a:stretch>
@@ -2007,8 +3000,12 @@
     </w:p>
     <w:p>
       <w:pPr>
-        <w:pStyle w:val="Stil2"/>
-      </w:pPr>
+        <w:pStyle w:val="Balk2"/>
+      </w:pPr>
+      <w:bookmarkStart w:id="28" w:name="_Toc227525515"/>
+      <w:bookmarkStart w:id="29" w:name="_Toc227525533"/>
+      <w:bookmarkStart w:id="30" w:name="_Toc227526670"/>
+      <w:bookmarkStart w:id="31" w:name="_Toc227526759"/>
       <w:r>
         <w:t>Kısıtlı Ortamlarda Yedekleme Otomasyonu (</w:t>
       </w:r>
@@ -2028,6 +3025,10 @@
       <w:r>
         <w:t>)</w:t>
       </w:r>
+      <w:bookmarkEnd w:id="28"/>
+      <w:bookmarkEnd w:id="29"/>
+      <w:bookmarkEnd w:id="30"/>
+      <w:bookmarkEnd w:id="31"/>
     </w:p>
     <w:p>
       <w:pPr>
@@ -2137,7 +3138,7 @@
                     <pic:cNvPicPr/>
                   </pic:nvPicPr>
                   <pic:blipFill>
-                    <a:blip r:embed="rId19"/>
+                    <a:blip r:embed="rId21"/>
                     <a:stretch>
                       <a:fillRect/>
                     </a:stretch>
@@ -2247,7 +3248,7 @@
                     </pic:cNvPicPr>
                   </pic:nvPicPr>
                   <pic:blipFill>
-                    <a:blip r:embed="rId20">
+                    <a:blip r:embed="rId22">
                       <a:extLst>
                         <a:ext uri="{28A0092B-C50C-407E-A947-70E740481C1C}">
                           <a14:useLocalDpi xmlns:a14="http://schemas.microsoft.com/office/drawing/2010/main" val="0"/>
@@ -2310,7 +3311,7 @@
                     <pic:cNvPicPr/>
                   </pic:nvPicPr>
                   <pic:blipFill>
-                    <a:blip r:embed="rId21"/>
+                    <a:blip r:embed="rId23"/>
                     <a:stretch>
                       <a:fillRect/>
                     </a:stretch>
@@ -2353,16 +3354,24 @@
     </w:p>
     <w:p>
       <w:pPr>
-        <w:pStyle w:val="Stil2"/>
+        <w:pStyle w:val="Balk2"/>
         <w:rPr>
           <w:rFonts w:ascii="Times New Roman" w:eastAsia="Times New Roman" w:hAnsi="Times New Roman"/>
           <w:sz w:val="27"/>
           <w:szCs w:val="27"/>
         </w:rPr>
       </w:pPr>
+      <w:bookmarkStart w:id="32" w:name="_Toc227525516"/>
+      <w:bookmarkStart w:id="33" w:name="_Toc227525534"/>
+      <w:bookmarkStart w:id="34" w:name="_Toc227526671"/>
+      <w:bookmarkStart w:id="35" w:name="_Toc227526760"/>
       <w:r>
         <w:t>Olağanüstü Durum Kurtarma: Point-in-Time Restore</w:t>
       </w:r>
+      <w:bookmarkEnd w:id="32"/>
+      <w:bookmarkEnd w:id="33"/>
+      <w:bookmarkEnd w:id="34"/>
+      <w:bookmarkEnd w:id="35"/>
     </w:p>
     <w:p>
       <w:pPr>
@@ -2512,8 +3521,12 @@
     </w:p>
     <w:p>
       <w:pPr>
-        <w:pStyle w:val="Stil2"/>
-      </w:pPr>
+        <w:pStyle w:val="Balk2"/>
+      </w:pPr>
+      <w:bookmarkStart w:id="36" w:name="_Toc227525517"/>
+      <w:bookmarkStart w:id="37" w:name="_Toc227525535"/>
+      <w:bookmarkStart w:id="38" w:name="_Toc227526672"/>
+      <w:bookmarkStart w:id="39" w:name="_Toc227526761"/>
       <w:r>
         <w:t>Veri Doğrulama (</w:t>
       </w:r>
@@ -2525,6 +3538,10 @@
       <w:r>
         <w:t>)</w:t>
       </w:r>
+      <w:bookmarkEnd w:id="36"/>
+      <w:bookmarkEnd w:id="37"/>
+      <w:bookmarkEnd w:id="38"/>
+      <w:bookmarkEnd w:id="39"/>
     </w:p>
     <w:p>
       <w:pPr>
@@ -2578,7 +3595,7 @@
                     <pic:cNvPicPr/>
                   </pic:nvPicPr>
                   <pic:blipFill>
-                    <a:blip r:embed="rId22"/>
+                    <a:blip r:embed="rId24"/>
                     <a:stretch>
                       <a:fillRect/>
                     </a:stretch>
@@ -2600,8 +3617,10 @@
       </w:r>
     </w:p>
     <w:sectPr>
+      <w:footerReference w:type="default" r:id="rId25"/>
       <w:pgSz w:w="11906" w:h="16838"/>
       <w:pgMar w:top="1417" w:right="1417" w:bottom="1417" w:left="1417" w:header="708" w:footer="708" w:gutter="0"/>
+      <w:pgNumType w:start="1"/>
       <w:cols w:space="708"/>
       <w:docGrid w:linePitch="360"/>
     </w:sectPr>
@@ -2632,6 +3651,64 @@
     </w:p>
   </w:endnote>
 </w:endnotes>
+</file>
+
+<file path=word/footer1.xml><?xml version="1.0" encoding="utf-8"?>
+<w:ftr xmlns:wpc="http://schemas.microsoft.com/office/word/2010/wordprocessingCanvas" xmlns:cx="http://schemas.microsoft.com/office/drawing/2014/chartex" xmlns:cx1="http://schemas.microsoft.com/office/drawing/2015/9/8/chartex" xmlns:cx2="http://schemas.microsoft.com/office/drawing/2015/10/21/chartex" xmlns:cx3="http://schemas.microsoft.com/office/drawing/2016/5/9/chartex" xmlns:cx4="http://schemas.microsoft.com/office/drawing/2016/5/10/chartex" xmlns:cx5="http://schemas.microsoft.com/office/drawing/2016/5/11/chartex" xmlns:cx6="http://schemas.microsoft.com/office/drawing/2016/5/12/chartex" xmlns:cx7="http://schemas.microsoft.com/office/drawing/2016/5/13/chartex" xmlns:cx8="http://schemas.microsoft.com/office/drawing/2016/5/14/chartex" xmlns:mc="http://schemas.openxmlformats.org/markup-compatibility/2006" xmlns:aink="http://schemas.microsoft.com/office/drawing/2016/ink" xmlns:am3d="http://schemas.microsoft.com/office/drawing/2017/model3d" xmlns:o="urn:schemas-microsoft-com:office:office" xmlns:oel="http://schemas.microsoft.com/office/2019/extlst" xmlns:r="http://schemas.openxmlformats.org/officeDocument/2006/relationships" xmlns:m="http://schemas.openxmlformats.org/officeDocument/2006/math" xmlns:v="urn:schemas-microsoft-com:vml" xmlns:wp14="http://schemas.microsoft.com/office/word/2010/wordprocessingDrawing" xmlns:wp="http://schemas.openxmlformats.org/drawingml/2006/wordprocessingDrawing" xmlns:w10="urn:schemas-microsoft-com:office:word" xmlns:w="http://schemas.openxmlformats.org/wordprocessingml/2006/main" xmlns:w14="http://schemas.microsoft.com/office/word/2010/wordml" xmlns:w15="http://schemas.microsoft.com/office/word/2012/wordml" xmlns:w16cex="http://schemas.microsoft.com/office/word/2018/wordml/cex" xmlns:w16cid="http://schemas.microsoft.com/office/word/2016/wordml/cid" xmlns:w16="http://schemas.microsoft.com/office/word/2018/wordml" xmlns:w16du="http://schemas.microsoft.com/office/word/2023/wordml/word16du" xmlns:w16sdtdh="http://schemas.microsoft.com/office/word/2020/wordml/sdtdatahash" xmlns:w16sdtfl="http://schemas.microsoft.com/office/word/2024/wordml/sdtformatlock" xmlns:w16se="http://schemas.microsoft.com/office/word/2015/wordml/symex" xmlns:wpg="http://schemas.microsoft.com/office/word/2010/wordprocessingGroup" xmlns:wpi="http://schemas.microsoft.com/office/word/2010/wordprocessingInk" xmlns:wne="http://schemas.microsoft.com/office/word/2006/wordml" xmlns:wps="http://schemas.microsoft.com/office/word/2010/wordprocessingShape" mc:Ignorable="w14 w15 w16se w16cid w16 w16cex w16sdtdh w16sdtfl w16du wp14">
+  <w:p>
+    <w:pPr>
+      <w:pStyle w:val="AltBilgi"/>
+      <w:jc w:val="center"/>
+    </w:pPr>
+  </w:p>
+  <w:p>
+    <w:pPr>
+      <w:pStyle w:val="AltBilgi"/>
+    </w:pPr>
+  </w:p>
+</w:ftr>
+</file>
+
+<file path=word/footer2.xml><?xml version="1.0" encoding="utf-8"?>
+<w:ftr xmlns:wpc="http://schemas.microsoft.com/office/word/2010/wordprocessingCanvas" xmlns:cx="http://schemas.microsoft.com/office/drawing/2014/chartex" xmlns:cx1="http://schemas.microsoft.com/office/drawing/2015/9/8/chartex" xmlns:cx2="http://schemas.microsoft.com/office/drawing/2015/10/21/chartex" xmlns:cx3="http://schemas.microsoft.com/office/drawing/2016/5/9/chartex" xmlns:cx4="http://schemas.microsoft.com/office/drawing/2016/5/10/chartex" xmlns:cx5="http://schemas.microsoft.com/office/drawing/2016/5/11/chartex" xmlns:cx6="http://schemas.microsoft.com/office/drawing/2016/5/12/chartex" xmlns:cx7="http://schemas.microsoft.com/office/drawing/2016/5/13/chartex" xmlns:cx8="http://schemas.microsoft.com/office/drawing/2016/5/14/chartex" xmlns:mc="http://schemas.openxmlformats.org/markup-compatibility/2006" xmlns:aink="http://schemas.microsoft.com/office/drawing/2016/ink" xmlns:am3d="http://schemas.microsoft.com/office/drawing/2017/model3d" xmlns:o="urn:schemas-microsoft-com:office:office" xmlns:oel="http://schemas.microsoft.com/office/2019/extlst" xmlns:r="http://schemas.openxmlformats.org/officeDocument/2006/relationships" xmlns:m="http://schemas.openxmlformats.org/officeDocument/2006/math" xmlns:v="urn:schemas-microsoft-com:vml" xmlns:wp14="http://schemas.microsoft.com/office/word/2010/wordprocessingDrawing" xmlns:wp="http://schemas.openxmlformats.org/drawingml/2006/wordprocessingDrawing" xmlns:w10="urn:schemas-microsoft-com:office:word" xmlns:w="http://schemas.openxmlformats.org/wordprocessingml/2006/main" xmlns:w14="http://schemas.microsoft.com/office/word/2010/wordml" xmlns:w15="http://schemas.microsoft.com/office/word/2012/wordml" xmlns:w16cex="http://schemas.microsoft.com/office/word/2018/wordml/cex" xmlns:w16cid="http://schemas.microsoft.com/office/word/2016/wordml/cid" xmlns:w16="http://schemas.microsoft.com/office/word/2018/wordml" xmlns:w16du="http://schemas.microsoft.com/office/word/2023/wordml/word16du" xmlns:w16sdtdh="http://schemas.microsoft.com/office/word/2020/wordml/sdtdatahash" xmlns:w16sdtfl="http://schemas.microsoft.com/office/word/2024/wordml/sdtformatlock" xmlns:w16se="http://schemas.microsoft.com/office/word/2015/wordml/symex" xmlns:wpg="http://schemas.microsoft.com/office/word/2010/wordprocessingGroup" xmlns:wpi="http://schemas.microsoft.com/office/word/2010/wordprocessingInk" xmlns:wne="http://schemas.microsoft.com/office/word/2006/wordml" xmlns:wps="http://schemas.microsoft.com/office/word/2010/wordprocessingShape" mc:Ignorable="w14 w15 w16se w16cid w16 w16cex w16sdtdh w16sdtfl w16du wp14">
+  <w:sdt>
+    <w:sdtPr>
+      <w:id w:val="1562522301"/>
+      <w:docPartObj>
+        <w:docPartGallery w:val="Page Numbers (Bottom of Page)"/>
+        <w:docPartUnique/>
+      </w:docPartObj>
+    </w:sdtPr>
+    <w:sdtContent>
+      <w:p>
+        <w:pPr>
+          <w:pStyle w:val="AltBilgi"/>
+          <w:jc w:val="center"/>
+        </w:pPr>
+        <w:r>
+          <w:fldChar w:fldCharType="begin"/>
+        </w:r>
+        <w:r>
+          <w:instrText>PAGE   \* MERGEFORMAT</w:instrText>
+        </w:r>
+        <w:r>
+          <w:fldChar w:fldCharType="separate"/>
+        </w:r>
+        <w:r>
+          <w:t>2</w:t>
+        </w:r>
+        <w:r>
+          <w:fldChar w:fldCharType="end"/>
+        </w:r>
+      </w:p>
+    </w:sdtContent>
+  </w:sdt>
+  <w:p>
+    <w:pPr>
+      <w:pStyle w:val="AltBilgi"/>
+    </w:pPr>
+  </w:p>
+</w:ftr>
 </file>
 
 <file path=word/footnotes.xml><?xml version="1.0" encoding="utf-8"?>
@@ -4013,7 +5090,7 @@
   <w:abstractNum w:abstractNumId="10" w15:restartNumberingAfterBreak="0">
     <w:nsid w:val="628437C8"/>
     <w:multiLevelType w:val="multilevel"/>
-    <w:tmpl w:val="2D22D292"/>
+    <w:tmpl w:val="CEA4F164"/>
     <w:lvl w:ilvl="0">
       <w:start w:val="1"/>
       <w:numFmt w:val="decimal"/>
@@ -4588,47 +5665,29 @@
   </w:style>
   <w:style w:type="paragraph" w:styleId="Balk1">
     <w:name w:val="heading 1"/>
-    <w:basedOn w:val="Normal"/>
+    <w:basedOn w:val="Stil1"/>
     <w:next w:val="Normal"/>
     <w:link w:val="Balk1Char"/>
     <w:uiPriority w:val="9"/>
     <w:qFormat/>
-    <w:rsid w:val="00C77726"/>
+    <w:rsid w:val="00856F58"/>
     <w:pPr>
-      <w:keepNext/>
-      <w:keepLines/>
-      <w:spacing w:before="360" w:after="80"/>
       <w:outlineLvl w:val="0"/>
     </w:pPr>
-    <w:rPr>
-      <w:rFonts w:asciiTheme="majorHAnsi" w:eastAsiaTheme="majorEastAsia" w:hAnsiTheme="majorHAnsi" w:cstheme="majorBidi"/>
-      <w:color w:val="0F4761" w:themeColor="accent1" w:themeShade="BF"/>
-      <w:sz w:val="40"/>
-      <w:szCs w:val="40"/>
-    </w:rPr>
   </w:style>
   <w:style w:type="paragraph" w:styleId="Balk2">
     <w:name w:val="heading 2"/>
-    <w:basedOn w:val="Normal"/>
+    <w:basedOn w:val="Stil2"/>
     <w:next w:val="Normal"/>
     <w:link w:val="Balk2Char"/>
     <w:uiPriority w:val="9"/>
-    <w:semiHidden/>
     <w:unhideWhenUsed/>
     <w:qFormat/>
-    <w:rsid w:val="00C77726"/>
+    <w:rsid w:val="008455B2"/>
     <w:pPr>
-      <w:keepNext/>
-      <w:keepLines/>
-      <w:spacing w:before="160" w:after="80"/>
+      <w:jc w:val="both"/>
       <w:outlineLvl w:val="1"/>
     </w:pPr>
-    <w:rPr>
-      <w:rFonts w:asciiTheme="majorHAnsi" w:eastAsiaTheme="majorEastAsia" w:hAnsiTheme="majorHAnsi" w:cstheme="majorBidi"/>
-      <w:color w:val="0F4761" w:themeColor="accent1" w:themeShade="BF"/>
-      <w:sz w:val="32"/>
-      <w:szCs w:val="32"/>
-    </w:rPr>
   </w:style>
   <w:style w:type="paragraph" w:styleId="Balk3">
     <w:name w:val="heading 3"/>
@@ -4817,12 +5876,12 @@
     <w:basedOn w:val="VarsaylanParagrafYazTipi"/>
     <w:link w:val="Balk1"/>
     <w:uiPriority w:val="9"/>
-    <w:rsid w:val="00C77726"/>
+    <w:rsid w:val="00856F58"/>
     <w:rPr>
-      <w:rFonts w:asciiTheme="majorHAnsi" w:eastAsiaTheme="majorEastAsia" w:hAnsiTheme="majorHAnsi" w:cstheme="majorBidi"/>
-      <w:color w:val="0F4761" w:themeColor="accent1" w:themeShade="BF"/>
-      <w:sz w:val="40"/>
-      <w:szCs w:val="40"/>
+      <w:rFonts w:ascii="Arial" w:eastAsia="Calibri" w:hAnsi="Arial" w:cs="Arial"/>
+      <w:b/>
+      <w:kern w:val="0"/>
+      <w14:ligatures w14:val="none"/>
     </w:rPr>
   </w:style>
   <w:style w:type="character" w:customStyle="1" w:styleId="Balk2Char">
@@ -4830,13 +5889,14 @@
     <w:basedOn w:val="VarsaylanParagrafYazTipi"/>
     <w:link w:val="Balk2"/>
     <w:uiPriority w:val="9"/>
-    <w:semiHidden/>
-    <w:rsid w:val="00C77726"/>
+    <w:rsid w:val="008455B2"/>
     <w:rPr>
-      <w:rFonts w:asciiTheme="majorHAnsi" w:eastAsiaTheme="majorEastAsia" w:hAnsiTheme="majorHAnsi" w:cstheme="majorBidi"/>
-      <w:color w:val="0F4761" w:themeColor="accent1" w:themeShade="BF"/>
-      <w:sz w:val="32"/>
-      <w:szCs w:val="32"/>
+      <w:rFonts w:ascii="Arial" w:eastAsia="Calibri" w:hAnsi="Arial" w:cs="Arial"/>
+      <w:b/>
+      <w:bCs/>
+      <w:kern w:val="0"/>
+      <w:u w:val="single"/>
+      <w14:ligatures w14:val="none"/>
     </w:rPr>
   </w:style>
   <w:style w:type="character" w:customStyle="1" w:styleId="Balk3Char">
@@ -5253,6 +6313,94 @@
       <w:shd w:val="clear" w:color="auto" w:fill="E1DFDD"/>
     </w:rPr>
   </w:style>
+  <w:style w:type="paragraph" w:styleId="T1">
+    <w:name w:val="toc 1"/>
+    <w:basedOn w:val="Normal"/>
+    <w:next w:val="Normal"/>
+    <w:autoRedefine/>
+    <w:uiPriority w:val="39"/>
+    <w:unhideWhenUsed/>
+    <w:rsid w:val="009F6A95"/>
+    <w:pPr>
+      <w:tabs>
+        <w:tab w:val="left" w:pos="720"/>
+        <w:tab w:val="right" w:leader="dot" w:pos="9061"/>
+      </w:tabs>
+      <w:spacing w:after="360" w:line="360" w:lineRule="auto"/>
+    </w:pPr>
+    <w:rPr>
+      <w:rFonts w:ascii="Arial" w:hAnsi="Arial"/>
+      <w:b/>
+      <w:sz w:val="24"/>
+    </w:rPr>
+  </w:style>
+  <w:style w:type="paragraph" w:styleId="T2">
+    <w:name w:val="toc 2"/>
+    <w:basedOn w:val="Normal"/>
+    <w:next w:val="Normal"/>
+    <w:autoRedefine/>
+    <w:uiPriority w:val="39"/>
+    <w:unhideWhenUsed/>
+    <w:rsid w:val="009F6A95"/>
+    <w:pPr>
+      <w:tabs>
+        <w:tab w:val="left" w:pos="960"/>
+        <w:tab w:val="left" w:pos="1680"/>
+        <w:tab w:val="right" w:leader="dot" w:pos="9061"/>
+      </w:tabs>
+      <w:spacing w:after="360" w:line="360" w:lineRule="auto"/>
+      <w:ind w:left="227"/>
+    </w:pPr>
+    <w:rPr>
+      <w:rFonts w:ascii="Arial" w:hAnsi="Arial"/>
+      <w:b/>
+      <w:sz w:val="24"/>
+    </w:rPr>
+  </w:style>
+  <w:style w:type="paragraph" w:styleId="TBal">
+    <w:name w:val="TOC Heading"/>
+    <w:basedOn w:val="Balk1"/>
+    <w:next w:val="Normal"/>
+    <w:uiPriority w:val="39"/>
+    <w:unhideWhenUsed/>
+    <w:qFormat/>
+    <w:rsid w:val="008455B2"/>
+    <w:pPr>
+      <w:keepNext/>
+      <w:keepLines/>
+      <w:numPr>
+        <w:numId w:val="0"/>
+      </w:numPr>
+      <w:spacing w:before="240" w:after="0" w:line="259" w:lineRule="auto"/>
+      <w:jc w:val="left"/>
+      <w:outlineLvl w:val="9"/>
+    </w:pPr>
+    <w:rPr>
+      <w:rFonts w:asciiTheme="majorHAnsi" w:eastAsiaTheme="majorEastAsia" w:hAnsiTheme="majorHAnsi" w:cstheme="majorBidi"/>
+      <w:b w:val="0"/>
+      <w:color w:val="0F4761" w:themeColor="accent1" w:themeShade="BF"/>
+      <w:sz w:val="32"/>
+      <w:szCs w:val="32"/>
+      <w:lang w:eastAsia="tr-TR"/>
+    </w:rPr>
+  </w:style>
+  <w:style w:type="paragraph" w:styleId="T3">
+    <w:name w:val="toc 3"/>
+    <w:basedOn w:val="Normal"/>
+    <w:next w:val="Normal"/>
+    <w:autoRedefine/>
+    <w:uiPriority w:val="39"/>
+    <w:unhideWhenUsed/>
+    <w:rsid w:val="008455B2"/>
+    <w:pPr>
+      <w:spacing w:after="100" w:line="259" w:lineRule="auto"/>
+      <w:ind w:left="440"/>
+    </w:pPr>
+    <w:rPr>
+      <w:rFonts w:asciiTheme="minorHAnsi" w:eastAsiaTheme="minorEastAsia" w:hAnsiTheme="minorHAnsi"/>
+      <w:lang w:eastAsia="tr-TR"/>
+    </w:rPr>
+  </w:style>
 </w:styles>
 </file>
 
@@ -5569,4 +6717,16 @@
     </a:ext>
   </a:extLst>
 </a:theme>
+</file>
+
+<file path=customXml/item1.xml><?xml version="1.0" encoding="utf-8"?>
+<b:Sources xmlns:b="http://schemas.openxmlformats.org/officeDocument/2006/bibliography" xmlns="http://schemas.openxmlformats.org/officeDocument/2006/bibliography" SelectedStyle="\APASixthEditionOfficeOnline.xsl" StyleName="APA" Version="6"/>
+</file>
+
+<file path=customXml/itemProps1.xml><?xml version="1.0" encoding="utf-8"?>
+<ds:datastoreItem xmlns:ds="http://schemas.openxmlformats.org/officeDocument/2006/customXml" ds:itemID="{394FE33C-B38B-4349-A819-905FD414A8ED}">
+  <ds:schemaRefs>
+    <ds:schemaRef ds:uri="http://schemas.openxmlformats.org/officeDocument/2006/bibliography"/>
+  </ds:schemaRefs>
+</ds:datastoreItem>
 </file>
</xml_diff>